<commit_message>
Ship the corrected resume
The download served the original file, which still contained a "responsein"
typo, an "improving first contentful paint by seconds" clause with no
number, a tense slip, unresolved [N] placeholders, and a B.Tech wrongly
attributed to Washington State University.

Replaces it with the corrected version: real figures (15,000+ small
businesses, 3+ feature teams, 50+ enterprise clients) and Bhilai Institute
of Technology, Raipur as the B.Tech institution.
</commit_message>
<xml_diff>
--- a/public/Amandeep_Singh_Saini_Resume.docx
+++ b/public/Amandeep_Singh_Saini_Resume.docx
@@ -48,7 +48,7 @@
         <w:spacing w:after="100"/>
         <w:jc w:val="center"/>
       </w:pPr>
-      <w:hyperlink r:id="Reb05f20934664d7d">
+      <w:hyperlink r:id="Rf4789fbef4db4ea0">
         <w:r>
           <w:rPr>
             <w:rStyle w:val="Hyperlink"/>
@@ -70,7 +70,7 @@
         </w:rPr>
         <w:t xml:space="preserve">  |  </w:t>
       </w:r>
-      <w:hyperlink r:id="Rd1daf683d7e748d4">
+      <w:hyperlink r:id="Rcc9f19f6f2b443d0">
         <w:r>
           <w:rPr>
             <w:rStyle w:val="Hyperlink"/>
@@ -104,7 +104,7 @@
         <w:t>Summary</w:t>
       </w:r>
     </w:p>
-    <w:p xmlns:wp14="http://schemas.microsoft.com/office/word/2010/wordml" wp14:textId="72634D5C">
+    <w:p xmlns:wp14="http://schemas.microsoft.com/office/word/2010/wordml" wp14:textId="7CD257DC">
       <w:pPr>
         <w:spacing w:after="40" w:line="198" w:lineRule="auto"/>
         <w:jc w:val="both"/>
@@ -126,7 +126,29 @@
           <w:szCs w:val="18"/>
           <w:lang w:val="en-US"/>
         </w:rPr>
-        <w:t>Senior Software Engineer with 10+ years building and scaling full-stack web platforms across SaaS, fintech, and enterprise. Owns front-end architecture for React, Vue 3, and TypeScript systems and ships production AI features — LLM agent orchestration, MCP tool servers, and RAG pipelines over vector databases. Leads onshore and offshore engineers from architecture through Kubernetes deployment.</w:t>
+        <w:t xml:space="preserve">Senior Software Engineer with 10+ </w:t>
+      </w:r>
+      <w:r>
+        <w:rPr>
+          <w:rFonts w:ascii="Calibri" w:hAnsi="Calibri" w:eastAsia="Calibri" w:cs="Calibri"/>
+          <w:b w:val="0"/>
+          <w:bCs w:val="0"/>
+          <w:sz w:val="18"/>
+          <w:szCs w:val="18"/>
+          <w:lang w:val="en-US"/>
+        </w:rPr>
+        <w:t>years of</w:t>
+      </w:r>
+      <w:r>
+        <w:rPr>
+          <w:rFonts w:ascii="Calibri" w:hAnsi="Calibri" w:eastAsia="Calibri" w:cs="Calibri"/>
+          <w:b w:val="0"/>
+          <w:bCs w:val="0"/>
+          <w:sz w:val="18"/>
+          <w:szCs w:val="18"/>
+          <w:lang w:val="en-US"/>
+        </w:rPr>
+        <w:t xml:space="preserve"> building and scaling full-stack web platforms across SaaS, fintech, and enterprise. Owns front-end architecture for React, Vue 3, and TypeScript systems and ships production AI features — LLM agent orchestration, MCP tool servers, and RAG pipelines over vector databases. Leads onshore and offshore engineers from architecture through Kubernetes deployment.</w:t>
       </w:r>
     </w:p>
     <w:p xmlns:wp14="http://schemas.microsoft.com/office/word/2010/wordml" wp14:textId="77777777">
@@ -506,7 +528,7 @@
         </w:tc>
       </w:tr>
     </w:tbl>
-    <w:p xmlns:wp14="http://schemas.microsoft.com/office/word/2010/wordml" wp14:textId="77777777">
+    <w:p xmlns:wp14="http://schemas.microsoft.com/office/word/2010/wordml" wp14:textId="2579DE9B">
       <w:pPr>
         <w:pStyle w:val="ListParagraph"/>
         <w:numPr>
@@ -529,7 +551,25 @@
           <w:szCs w:val="18"/>
           <w:lang w:val="en-US"/>
         </w:rPr>
-        <w:t>Architected and shipped a Python agent orchestration service — a multi-tenant API where internal product teams register, configure, and run their own LLM agents — replacing per-team one-off integrations across a CRM and marketing-automation platform serving [X],000+ small businesses.</w:t>
+        <w:t xml:space="preserve">Architected and shipped a Python agent orchestration service — a multi-tenant API where internal product teams register, configure, and run their own LLM agents — replacing per-team one-off integrations across a CRM and marketing-automation platform serving </w:t>
+      </w:r>
+      <w:r>
+        <w:rPr>
+          <w:rFonts w:ascii="Calibri" w:hAnsi="Calibri" w:eastAsia="Calibri" w:cs="Calibri"/>
+          <w:sz w:val="18"/>
+          <w:szCs w:val="18"/>
+          <w:lang w:val="en-US"/>
+        </w:rPr>
+        <w:t>15</w:t>
+      </w:r>
+      <w:r>
+        <w:rPr>
+          <w:rFonts w:ascii="Calibri" w:hAnsi="Calibri" w:eastAsia="Calibri" w:cs="Calibri"/>
+          <w:sz w:val="18"/>
+          <w:szCs w:val="18"/>
+          <w:lang w:val="en-US"/>
+        </w:rPr>
+        <w:t>,000+ small businesses.</w:t>
       </w:r>
     </w:p>
     <w:p xmlns:wp14="http://schemas.microsoft.com/office/word/2010/wordml" wp14:textId="68FD402B">
@@ -576,7 +616,7 @@
         <w:t xml:space="preserve"> from weeks to days.</w:t>
       </w:r>
     </w:p>
-    <w:p xmlns:wp14="http://schemas.microsoft.com/office/word/2010/wordml" wp14:textId="7BB098A3">
+    <w:p xmlns:wp14="http://schemas.microsoft.com/office/word/2010/wordml" wp14:textId="2C1D50A6">
       <w:pPr>
         <w:pStyle w:val="ListParagraph"/>
         <w:numPr>
@@ -599,34 +639,61 @@
           <w:szCs w:val="18"/>
           <w:lang w:val="en-US"/>
         </w:rPr>
-        <w:t xml:space="preserve">Designed a memory RAG pipeline on a vector database grounding agent response in company </w:t>
-      </w:r>
-      <w:r>
-        <w:rPr>
-          <w:rFonts w:ascii="Calibri" w:hAnsi="Calibri" w:eastAsia="Calibri" w:cs="Calibri"/>
-          <w:sz w:val="18"/>
-          <w:szCs w:val="18"/>
-          <w:lang w:val="en-US"/>
-        </w:rPr>
-        <w:t>data and</w:t>
-      </w:r>
-      <w:r>
-        <w:rPr>
-          <w:rFonts w:ascii="Calibri" w:hAnsi="Calibri" w:eastAsia="Calibri" w:cs="Calibri"/>
-          <w:sz w:val="18"/>
-          <w:szCs w:val="18"/>
-          <w:lang w:val="en-US"/>
-        </w:rPr>
-        <w:t xml:space="preserve"> delivered the in-product AI chat experience end to end — streaming responses, conversation state, retry and fallback handling — in Vue 3 and </w:t>
-      </w:r>
-      <w:r>
-        <w:rPr>
-          <w:rFonts w:ascii="Calibri" w:hAnsi="Calibri" w:eastAsia="Calibri" w:cs="Calibri"/>
-          <w:sz w:val="18"/>
-          <w:szCs w:val="18"/>
-          <w:lang w:val="en-US"/>
-        </w:rPr>
-        <w:t>React</w:t>
+        <w:t xml:space="preserve">Designed a memory RAG pipeline on a </w:t>
+      </w:r>
+      <w:r>
+        <w:rPr>
+          <w:rFonts w:ascii="Calibri" w:hAnsi="Calibri" w:eastAsia="Calibri" w:cs="Calibri"/>
+          <w:sz w:val="18"/>
+          <w:szCs w:val="18"/>
+          <w:lang w:val="en-US"/>
+        </w:rPr>
+        <w:t>vector database grounding agent response</w:t>
+      </w:r>
+      <w:r>
+        <w:rPr>
+          <w:rFonts w:ascii="Calibri" w:hAnsi="Calibri" w:eastAsia="Calibri" w:cs="Calibri"/>
+          <w:sz w:val="18"/>
+          <w:szCs w:val="18"/>
+          <w:lang w:val="en-US"/>
+        </w:rPr>
+        <w:t xml:space="preserve"> in company d</w:t>
+      </w:r>
+      <w:r>
+        <w:rPr>
+          <w:rFonts w:ascii="Calibri" w:hAnsi="Calibri" w:eastAsia="Calibri" w:cs="Calibri"/>
+          <w:sz w:val="18"/>
+          <w:szCs w:val="18"/>
+          <w:lang w:val="en-US"/>
+        </w:rPr>
+        <w:t>ata and d</w:t>
+      </w:r>
+      <w:r>
+        <w:rPr>
+          <w:rFonts w:ascii="Calibri" w:hAnsi="Calibri" w:eastAsia="Calibri" w:cs="Calibri"/>
+          <w:sz w:val="18"/>
+          <w:szCs w:val="18"/>
+          <w:lang w:val="en-US"/>
+        </w:rPr>
+        <w:t xml:space="preserve">elivered the in-product AI chat experience end to end — streaming responses, conversation state, retry and fallback handling — in Vue 3 and </w:t>
+      </w:r>
+      <w:r>
+        <w:rPr>
+          <w:rFonts w:ascii="Calibri" w:hAnsi="Calibri" w:eastAsia="Calibri" w:cs="Calibri"/>
+          <w:sz w:val="18"/>
+          <w:szCs w:val="18"/>
+          <w:lang w:val="en-US"/>
+        </w:rPr>
+        <w:t>Re</w:t>
+      </w:r>
+      <w:r>
+        <w:rPr>
+          <w:rFonts w:ascii="Calibri" w:hAnsi="Calibri" w:eastAsia="Calibri" w:cs="Calibri"/>
+          <w:sz w:val="18"/>
+          <w:szCs w:val="18"/>
+          <w:lang w:val="en-US"/>
+        </w:rPr>
+        <w:t>act</w:t>
       </w:r>
       <w:r>
         <w:rPr>
@@ -696,7 +763,7 @@
           <w:szCs w:val="18"/>
           <w:lang w:val="en-US"/>
         </w:rPr>
-        <w:t>ed</w:t>
+        <w:t/>
       </w:r>
       <w:r>
         <w:rPr>
@@ -898,7 +965,7 @@
         <w:t>Built and shipped a React and TypeScript eligibility platform determining member qualification for USAA banking and insurance products, serving a member base in the millions.</w:t>
       </w:r>
     </w:p>
-    <w:p xmlns:wp14="http://schemas.microsoft.com/office/word/2010/wordml" wp14:textId="63EAE23A">
+    <w:p xmlns:wp14="http://schemas.microsoft.com/office/word/2010/wordml" wp14:textId="6D9473BB">
       <w:pPr>
         <w:pStyle w:val="ListParagraph"/>
         <w:numPr>
@@ -939,10 +1006,28 @@
           <w:szCs w:val="18"/>
           <w:lang w:val="en-US"/>
         </w:rPr>
-        <w:t xml:space="preserve"> paint by  seconds.</w:t>
-      </w:r>
-    </w:p>
-    <w:p xmlns:wp14="http://schemas.microsoft.com/office/word/2010/wordml" wp14:textId="77777777">
+        <w:t xml:space="preserve"> paint</w:t>
+      </w:r>
+      <w:r>
+        <w:rPr>
+          <w:rFonts w:ascii="Calibri" w:hAnsi="Calibri" w:eastAsia="Calibri" w:cs="Calibri"/>
+          <w:sz w:val="18"/>
+          <w:szCs w:val="18"/>
+          <w:lang w:val="en-US"/>
+        </w:rPr>
+        <w:t/>
+      </w:r>
+      <w:r>
+        <w:rPr>
+          <w:rFonts w:ascii="Calibri" w:hAnsi="Calibri" w:eastAsia="Calibri" w:cs="Calibri"/>
+          <w:sz w:val="18"/>
+          <w:szCs w:val="18"/>
+          <w:lang w:val="en-US"/>
+        </w:rPr>
+        <w:t>.</w:t>
+      </w:r>
+    </w:p>
+    <w:p xmlns:wp14="http://schemas.microsoft.com/office/word/2010/wordml" wp14:textId="142DC9C3">
       <w:pPr>
         <w:pStyle w:val="ListParagraph"/>
         <w:numPr>
@@ -965,7 +1050,61 @@
           <w:szCs w:val="18"/>
           <w:lang w:val="en-US"/>
         </w:rPr>
-        <w:t>Architected Redux state management for a multi-step SPA and a reusable component system in JSX and SCSS, standardizing data flow across [N] feature teams and eliminating a recurring class of state-sync defects.</w:t>
+        <w:t xml:space="preserve">Architected Redux state management for a multi-step SPA and a reusable </w:t>
+      </w:r>
+      <w:r>
+        <w:rPr>
+          <w:rFonts w:ascii="Calibri" w:hAnsi="Calibri" w:eastAsia="Calibri" w:cs="Calibri"/>
+          <w:sz w:val="18"/>
+          <w:szCs w:val="18"/>
+          <w:lang w:val="en-US"/>
+        </w:rPr>
+        <w:t>component</w:t>
+      </w:r>
+      <w:r>
+        <w:rPr>
+          <w:rFonts w:ascii="Calibri" w:hAnsi="Calibri" w:eastAsia="Calibri" w:cs="Calibri"/>
+          <w:sz w:val="18"/>
+          <w:szCs w:val="18"/>
+          <w:lang w:val="en-US"/>
+        </w:rPr>
+        <w:t xml:space="preserve"> system in JSX and SCSS, standardizing data flow across </w:t>
+      </w:r>
+      <w:r>
+        <w:rPr>
+          <w:rFonts w:ascii="Calibri" w:hAnsi="Calibri" w:eastAsia="Calibri" w:cs="Calibri"/>
+          <w:sz w:val="18"/>
+          <w:szCs w:val="18"/>
+          <w:lang w:val="en-US"/>
+        </w:rPr>
+        <w:t>3+</w:t>
+      </w:r>
+      <w:r>
+        <w:rPr>
+          <w:rFonts w:ascii="Calibri" w:hAnsi="Calibri" w:eastAsia="Calibri" w:cs="Calibri"/>
+          <w:sz w:val="18"/>
+          <w:szCs w:val="18"/>
+          <w:lang w:val="en-US"/>
+        </w:rPr>
+        <w:t xml:space="preserve"> feature teams and </w:t>
+      </w:r>
+      <w:r>
+        <w:rPr>
+          <w:rFonts w:ascii="Calibri" w:hAnsi="Calibri" w:eastAsia="Calibri" w:cs="Calibri"/>
+          <w:sz w:val="18"/>
+          <w:szCs w:val="18"/>
+          <w:lang w:val="en-US"/>
+        </w:rPr>
+        <w:t>eliminating</w:t>
+      </w:r>
+      <w:r>
+        <w:rPr>
+          <w:rFonts w:ascii="Calibri" w:hAnsi="Calibri" w:eastAsia="Calibri" w:cs="Calibri"/>
+          <w:sz w:val="18"/>
+          <w:szCs w:val="18"/>
+          <w:lang w:val="en-US"/>
+        </w:rPr>
+        <w:t xml:space="preserve"> a recurring class of state-sync defects.</w:t>
       </w:r>
     </w:p>
     <w:p xmlns:wp14="http://schemas.microsoft.com/office/word/2010/wordml" wp14:textId="77777777">
@@ -1598,7 +1737,7 @@
         </w:tc>
       </w:tr>
     </w:tbl>
-    <w:p xmlns:wp14="http://schemas.microsoft.com/office/word/2010/wordml" wp14:textId="55287ECB">
+    <w:p xmlns:wp14="http://schemas.microsoft.com/office/word/2010/wordml" wp14:textId="46CBC2B4">
       <w:pPr>
         <w:pStyle w:val="ListParagraph"/>
         <w:numPr>
@@ -1624,7 +1763,25 @@
           <w:szCs w:val="18"/>
           <w:lang w:val="en-US"/>
         </w:rPr>
-        <w:t xml:space="preserve">Delivered client-facing web applications in Angular, React, JavaScript, HTML5, and CSS3 for [N]+ enterprise clients, improving page </w:t>
+        <w:t xml:space="preserve">Delivered client-facing web applications in Angular, React, JavaScript, HTML5, and CSS3 for </w:t>
+      </w:r>
+      <w:r>
+        <w:rPr>
+          <w:rFonts w:ascii="Calibri" w:hAnsi="Calibri" w:eastAsia="Calibri" w:cs="Calibri"/>
+          <w:sz w:val="18"/>
+          <w:szCs w:val="18"/>
+          <w:lang w:val="en-US"/>
+        </w:rPr>
+        <w:t>50</w:t>
+      </w:r>
+      <w:r>
+        <w:rPr>
+          <w:rFonts w:ascii="Calibri" w:hAnsi="Calibri" w:eastAsia="Calibri" w:cs="Calibri"/>
+          <w:sz w:val="18"/>
+          <w:szCs w:val="18"/>
+          <w:lang w:val="en-US"/>
+        </w:rPr>
+        <w:t xml:space="preserve">+ enterprise clients, improving page </w:t>
       </w:r>
       <w:r>
         <w:rPr>
@@ -1784,7 +1941,7 @@
                 <w:szCs w:val="18"/>
                 <w:lang w:val="en-US"/>
               </w:rPr>
-              <w:t>Washington State University</w:t>
+              <w:t>Bhilai Institute of Technology, Raipur</w:t>
             </w:r>
             <w:r>
               <w:rPr>

</xml_diff>